<commit_message>
Update LISTA DE EQUIPOS EN ATC.docx
</commit_message>
<xml_diff>
--- a/Informe de Pasantias/LISTA DE EQUIPOS EN ATC.docx
+++ b/Informe de Pasantias/LISTA DE EQUIPOS EN ATC.docx
@@ -1,6 +1,6 @@
 
 <file path=word/document.xml><?xml version="1.0" encoding="utf-8"?>
-<w:document xmlns:wpc="http://schemas.microsoft.com/office/word/2010/wordprocessingCanvas" xmlns:cx="http://schemas.microsoft.com/office/drawing/2014/chartex" xmlns:cx1="http://schemas.microsoft.com/office/drawing/2015/9/8/chartex" xmlns:cx2="http://schemas.microsoft.com/office/drawing/2015/10/21/chartex" xmlns:cx3="http://schemas.microsoft.com/office/drawing/2016/5/9/chartex" xmlns:cx4="http://schemas.microsoft.com/office/drawing/2016/5/10/chartex" xmlns:cx5="http://schemas.microsoft.com/office/drawing/2016/5/11/chartex" xmlns:cx6="http://schemas.microsoft.com/office/drawing/2016/5/12/chartex" xmlns:cx7="http://schemas.microsoft.com/office/drawing/2016/5/13/chartex" xmlns:cx8="http://schemas.microsoft.com/office/drawing/2016/5/14/chartex" xmlns:mc="http://schemas.openxmlformats.org/markup-compatibility/2006" xmlns:aink="http://schemas.microsoft.com/office/drawing/2016/ink" xmlns:am3d="http://schemas.microsoft.com/office/drawing/2017/model3d" xmlns:o="urn:schemas-microsoft-com:office:office" xmlns:oel="http://schemas.microsoft.com/office/2019/extlst" xmlns:r="http://schemas.openxmlformats.org/officeDocument/2006/relationships" xmlns:m="http://schemas.openxmlformats.org/officeDocument/2006/math" xmlns:v="urn:schemas-microsoft-com:vml" xmlns:wp14="http://schemas.microsoft.com/office/word/2010/wordprocessingDrawing" xmlns:wp="http://schemas.openxmlformats.org/drawingml/2006/wordprocessingDrawing" xmlns:w10="urn:schemas-microsoft-com:office:word" xmlns:w="http://schemas.openxmlformats.org/wordprocessingml/2006/main" xmlns:w14="http://schemas.microsoft.com/office/word/2010/wordml" xmlns:w15="http://schemas.microsoft.com/office/word/2012/wordml" xmlns:w16cex="http://schemas.microsoft.com/office/word/2018/wordml/cex" xmlns:w16cid="http://schemas.microsoft.com/office/word/2016/wordml/cid" xmlns:w16="http://schemas.microsoft.com/office/word/2018/wordml" xmlns:w16sdtdh="http://schemas.microsoft.com/office/word/2020/wordml/sdtdatahash" xmlns:w16se="http://schemas.microsoft.com/office/word/2015/wordml/symex" xmlns:wpg="http://schemas.microsoft.com/office/word/2010/wordprocessingGroup" xmlns:wpi="http://schemas.microsoft.com/office/word/2010/wordprocessingInk" xmlns:wne="http://schemas.microsoft.com/office/word/2006/wordml" xmlns:wps="http://schemas.microsoft.com/office/word/2010/wordprocessingShape" mc:Ignorable="w14 w15 w16se w16cid w16 w16cex w16sdtdh wp14">
+<w:document xmlns:wpc="http://schemas.microsoft.com/office/word/2010/wordprocessingCanvas" xmlns:cx="http://schemas.microsoft.com/office/drawing/2014/chartex" xmlns:cx1="http://schemas.microsoft.com/office/drawing/2015/9/8/chartex" xmlns:cx2="http://schemas.microsoft.com/office/drawing/2015/10/21/chartex" xmlns:cx3="http://schemas.microsoft.com/office/drawing/2016/5/9/chartex" xmlns:cx4="http://schemas.microsoft.com/office/drawing/2016/5/10/chartex" xmlns:cx5="http://schemas.microsoft.com/office/drawing/2016/5/11/chartex" xmlns:cx6="http://schemas.microsoft.com/office/drawing/2016/5/12/chartex" xmlns:cx7="http://schemas.microsoft.com/office/drawing/2016/5/13/chartex" xmlns:cx8="http://schemas.microsoft.com/office/drawing/2016/5/14/chartex" xmlns:mc="http://schemas.openxmlformats.org/markup-compatibility/2006" xmlns:aink="http://schemas.microsoft.com/office/drawing/2016/ink" xmlns:am3d="http://schemas.microsoft.com/office/drawing/2017/model3d" xmlns:o="urn:schemas-microsoft-com:office:office" xmlns:oel="http://schemas.microsoft.com/office/2019/extlst" xmlns:r="http://schemas.openxmlformats.org/officeDocument/2006/relationships" xmlns:m="http://schemas.openxmlformats.org/officeDocument/2006/math" xmlns:v="urn:schemas-microsoft-com:vml" xmlns:wp14="http://schemas.microsoft.com/office/word/2010/wordprocessingDrawing" xmlns:wp="http://schemas.openxmlformats.org/drawingml/2006/wordprocessingDrawing" xmlns:w10="urn:schemas-microsoft-com:office:word" xmlns:w="http://schemas.openxmlformats.org/wordprocessingml/2006/main" xmlns:w14="http://schemas.microsoft.com/office/word/2010/wordml" xmlns:w15="http://schemas.microsoft.com/office/word/2012/wordml" xmlns:w16cex="http://schemas.microsoft.com/office/word/2018/wordml/cex" xmlns:w16cid="http://schemas.microsoft.com/office/word/2016/wordml/cid" xmlns:w16="http://schemas.microsoft.com/office/word/2018/wordml" xmlns:w16du="http://schemas.microsoft.com/office/word/2023/wordml/word16du" xmlns:w16sdtdh="http://schemas.microsoft.com/office/word/2020/wordml/sdtdatahash" xmlns:w16sdtfl="http://schemas.microsoft.com/office/word/2024/wordml/sdtformatlock" xmlns:w16se="http://schemas.microsoft.com/office/word/2015/wordml/symex" xmlns:wpg="http://schemas.microsoft.com/office/word/2010/wordprocessingGroup" xmlns:wpi="http://schemas.microsoft.com/office/word/2010/wordprocessingInk" xmlns:wne="http://schemas.microsoft.com/office/word/2006/wordml" xmlns:wps="http://schemas.microsoft.com/office/word/2010/wordprocessingShape" mc:Ignorable="w14 w15 w16se w16cid w16 w16cex w16sdtdh w16sdtfl w16du wp14">
   <w:body>
     <w:p>
       <w:pPr>
@@ -232,23 +232,13 @@
                 <w:szCs w:val="24"/>
               </w:rPr>
             </w:pPr>
-            <w:proofErr w:type="spellStart"/>
-            <w:r>
-              <w:rPr>
-                <w:rFonts w:ascii="Arial" w:hAnsi="Arial" w:cs="Arial"/>
-                <w:sz w:val="24"/>
-                <w:szCs w:val="24"/>
-              </w:rPr>
-              <w:t>Optiplex</w:t>
-            </w:r>
-            <w:proofErr w:type="spellEnd"/>
-            <w:r>
-              <w:rPr>
-                <w:rFonts w:ascii="Arial" w:hAnsi="Arial" w:cs="Arial"/>
-                <w:sz w:val="24"/>
-                <w:szCs w:val="24"/>
-              </w:rPr>
-              <w:t xml:space="preserve"> 3050</w:t>
+            <w:r>
+              <w:rPr>
+                <w:rFonts w:ascii="Arial" w:hAnsi="Arial" w:cs="Arial"/>
+                <w:sz w:val="24"/>
+                <w:szCs w:val="24"/>
+              </w:rPr>
+              <w:t>Optiplex 3050</w:t>
             </w:r>
           </w:p>
         </w:tc>
@@ -609,18 +599,8 @@
                 <w:sz w:val="24"/>
                 <w:szCs w:val="24"/>
               </w:rPr>
-              <w:t xml:space="preserve">Memoria </w:t>
-            </w:r>
-            <w:proofErr w:type="spellStart"/>
-            <w:r>
-              <w:rPr>
-                <w:rFonts w:ascii="Arial" w:hAnsi="Arial" w:cs="Arial"/>
-                <w:sz w:val="24"/>
-                <w:szCs w:val="24"/>
-              </w:rPr>
-              <w:t>Ram</w:t>
-            </w:r>
-            <w:proofErr w:type="spellEnd"/>
+              <w:t>Memoria Ram</w:t>
+            </w:r>
           </w:p>
         </w:tc>
         <w:tc>
@@ -947,25 +927,7 @@
                 <w:sz w:val="24"/>
                 <w:szCs w:val="24"/>
               </w:rPr>
-              <w:t xml:space="preserve">Intel HD </w:t>
-            </w:r>
-            <w:proofErr w:type="spellStart"/>
-            <w:r>
-              <w:rPr>
-                <w:rFonts w:ascii="Arial" w:hAnsi="Arial" w:cs="Arial"/>
-                <w:sz w:val="24"/>
-                <w:szCs w:val="24"/>
-              </w:rPr>
-              <w:t>Graphics</w:t>
-            </w:r>
-            <w:proofErr w:type="spellEnd"/>
-            <w:r>
-              <w:rPr>
-                <w:rFonts w:ascii="Arial" w:hAnsi="Arial" w:cs="Arial"/>
-                <w:sz w:val="24"/>
-                <w:szCs w:val="24"/>
-              </w:rPr>
-              <w:t xml:space="preserve"> 630</w:t>
+              <w:t>Intel HD Graphics 630</w:t>
             </w:r>
           </w:p>
         </w:tc>
@@ -1273,7 +1235,6 @@
                 <w:szCs w:val="24"/>
               </w:rPr>
             </w:pPr>
-            <w:proofErr w:type="spellStart"/>
             <w:r>
               <w:rPr>
                 <w:rFonts w:ascii="Arial" w:hAnsi="Arial" w:cs="Arial"/>
@@ -1282,7 +1243,6 @@
               </w:rPr>
               <w:t>BegProd</w:t>
             </w:r>
-            <w:proofErr w:type="spellEnd"/>
           </w:p>
         </w:tc>
       </w:tr>
@@ -1731,15 +1691,7 @@
                 <w:sz w:val="24"/>
                 <w:szCs w:val="24"/>
               </w:rPr>
-              <w:t>Seri</w:t>
-            </w:r>
-            <w:r>
-              <w:rPr>
-                <w:rFonts w:ascii="Arial" w:hAnsi="Arial" w:cs="Arial"/>
-                <w:sz w:val="24"/>
-                <w:szCs w:val="24"/>
-              </w:rPr>
-              <w:t>al</w:t>
+              <w:t>Serial</w:t>
             </w:r>
           </w:p>
         </w:tc>
@@ -2437,23 +2389,13 @@
                 <w:szCs w:val="24"/>
               </w:rPr>
             </w:pPr>
-            <w:proofErr w:type="spellStart"/>
-            <w:r>
-              <w:rPr>
-                <w:rFonts w:ascii="Arial" w:hAnsi="Arial" w:cs="Arial"/>
-                <w:sz w:val="24"/>
-                <w:szCs w:val="24"/>
-              </w:rPr>
-              <w:t>EliteDesk</w:t>
-            </w:r>
-            <w:proofErr w:type="spellEnd"/>
-            <w:r>
-              <w:rPr>
-                <w:rFonts w:ascii="Arial" w:hAnsi="Arial" w:cs="Arial"/>
-                <w:sz w:val="24"/>
-                <w:szCs w:val="24"/>
-              </w:rPr>
-              <w:t xml:space="preserve"> 800 G2 SFF</w:t>
+            <w:r>
+              <w:rPr>
+                <w:rFonts w:ascii="Arial" w:hAnsi="Arial" w:cs="Arial"/>
+                <w:sz w:val="24"/>
+                <w:szCs w:val="24"/>
+              </w:rPr>
+              <w:t>EliteDesk 800 G2 SFF</w:t>
             </w:r>
           </w:p>
         </w:tc>
@@ -2814,18 +2756,8 @@
                 <w:sz w:val="24"/>
                 <w:szCs w:val="24"/>
               </w:rPr>
-              <w:t xml:space="preserve">Memoria </w:t>
-            </w:r>
-            <w:proofErr w:type="spellStart"/>
-            <w:r>
-              <w:rPr>
-                <w:rFonts w:ascii="Arial" w:hAnsi="Arial" w:cs="Arial"/>
-                <w:sz w:val="24"/>
-                <w:szCs w:val="24"/>
-              </w:rPr>
-              <w:t>Ram</w:t>
-            </w:r>
-            <w:proofErr w:type="spellEnd"/>
+              <w:t>Memoria Ram</w:t>
+            </w:r>
           </w:p>
         </w:tc>
         <w:tc>
@@ -3152,25 +3084,7 @@
                 <w:sz w:val="24"/>
                 <w:szCs w:val="24"/>
               </w:rPr>
-              <w:t xml:space="preserve">Intel HD </w:t>
-            </w:r>
-            <w:proofErr w:type="spellStart"/>
-            <w:r>
-              <w:rPr>
-                <w:rFonts w:ascii="Arial" w:hAnsi="Arial" w:cs="Arial"/>
-                <w:sz w:val="24"/>
-                <w:szCs w:val="24"/>
-              </w:rPr>
-              <w:t>Graphics</w:t>
-            </w:r>
-            <w:proofErr w:type="spellEnd"/>
-            <w:r>
-              <w:rPr>
-                <w:rFonts w:ascii="Arial" w:hAnsi="Arial" w:cs="Arial"/>
-                <w:sz w:val="24"/>
-                <w:szCs w:val="24"/>
-              </w:rPr>
-              <w:t xml:space="preserve"> 530</w:t>
+              <w:t>Intel HD Graphics 530</w:t>
             </w:r>
           </w:p>
         </w:tc>
@@ -4825,7 +4739,6 @@
                 <w:szCs w:val="24"/>
               </w:rPr>
             </w:pPr>
-            <w:proofErr w:type="spellStart"/>
             <w:r>
               <w:rPr>
                 <w:rFonts w:ascii="Arial" w:hAnsi="Arial" w:cs="Arial"/>
@@ -4834,7 +4747,6 @@
               </w:rPr>
               <w:t>ReclamosLaptop</w:t>
             </w:r>
-            <w:proofErr w:type="spellEnd"/>
           </w:p>
         </w:tc>
       </w:tr>
@@ -5039,18 +4951,8 @@
                 <w:sz w:val="24"/>
                 <w:szCs w:val="24"/>
               </w:rPr>
-              <w:t xml:space="preserve">Memoria </w:t>
-            </w:r>
-            <w:proofErr w:type="spellStart"/>
-            <w:r>
-              <w:rPr>
-                <w:rFonts w:ascii="Arial" w:hAnsi="Arial" w:cs="Arial"/>
-                <w:sz w:val="24"/>
-                <w:szCs w:val="24"/>
-              </w:rPr>
-              <w:t>Ram</w:t>
-            </w:r>
-            <w:proofErr w:type="spellEnd"/>
+              <w:t>Memoria Ram</w:t>
+            </w:r>
           </w:p>
         </w:tc>
         <w:tc>
@@ -5299,25 +5201,7 @@
                 <w:sz w:val="24"/>
                 <w:szCs w:val="24"/>
               </w:rPr>
-              <w:t xml:space="preserve">239 GB KXG60ZNV256GB </w:t>
-            </w:r>
-            <w:proofErr w:type="spellStart"/>
-            <w:r>
-              <w:rPr>
-                <w:rFonts w:ascii="Arial" w:hAnsi="Arial" w:cs="Arial"/>
-                <w:sz w:val="24"/>
-                <w:szCs w:val="24"/>
-              </w:rPr>
-              <w:t>NVMe</w:t>
-            </w:r>
-            <w:proofErr w:type="spellEnd"/>
-            <w:r>
-              <w:rPr>
-                <w:rFonts w:ascii="Arial" w:hAnsi="Arial" w:cs="Arial"/>
-                <w:sz w:val="24"/>
-                <w:szCs w:val="24"/>
-              </w:rPr>
-              <w:t xml:space="preserve"> TOSHIBA 256GB</w:t>
+              <w:t>239 GB KXG60ZNV256GB NVMe TOSHIBA 256GB</w:t>
             </w:r>
           </w:p>
         </w:tc>
@@ -5393,18 +5277,8 @@
                 <w:sz w:val="24"/>
                 <w:szCs w:val="24"/>
               </w:rPr>
-              <w:t xml:space="preserve">Intel UHD </w:t>
-            </w:r>
-            <w:proofErr w:type="spellStart"/>
-            <w:r>
-              <w:rPr>
-                <w:rFonts w:ascii="Arial" w:hAnsi="Arial" w:cs="Arial"/>
-                <w:sz w:val="24"/>
-                <w:szCs w:val="24"/>
-              </w:rPr>
-              <w:t>Graphics</w:t>
-            </w:r>
-            <w:proofErr w:type="spellEnd"/>
+              <w:t>Intel UHD Graphics</w:t>
+            </w:r>
           </w:p>
         </w:tc>
       </w:tr>
@@ -6187,23 +6061,13 @@
                 <w:szCs w:val="24"/>
               </w:rPr>
             </w:pPr>
-            <w:proofErr w:type="spellStart"/>
-            <w:r>
-              <w:rPr>
-                <w:rFonts w:ascii="Arial" w:hAnsi="Arial" w:cs="Arial"/>
-                <w:sz w:val="24"/>
-                <w:szCs w:val="24"/>
-              </w:rPr>
-              <w:t>OptiPlex</w:t>
-            </w:r>
-            <w:proofErr w:type="spellEnd"/>
-            <w:r>
-              <w:rPr>
-                <w:rFonts w:ascii="Arial" w:hAnsi="Arial" w:cs="Arial"/>
-                <w:sz w:val="24"/>
-                <w:szCs w:val="24"/>
-              </w:rPr>
-              <w:t xml:space="preserve"> 5080</w:t>
+            <w:r>
+              <w:rPr>
+                <w:rFonts w:ascii="Arial" w:hAnsi="Arial" w:cs="Arial"/>
+                <w:sz w:val="24"/>
+                <w:szCs w:val="24"/>
+              </w:rPr>
+              <w:t>OptiPlex 5080</w:t>
             </w:r>
           </w:p>
         </w:tc>
@@ -6564,18 +6428,8 @@
                 <w:sz w:val="24"/>
                 <w:szCs w:val="24"/>
               </w:rPr>
-              <w:t xml:space="preserve">Memoria </w:t>
-            </w:r>
-            <w:proofErr w:type="spellStart"/>
-            <w:r>
-              <w:rPr>
-                <w:rFonts w:ascii="Arial" w:hAnsi="Arial" w:cs="Arial"/>
-                <w:sz w:val="24"/>
-                <w:szCs w:val="24"/>
-              </w:rPr>
-              <w:t>Ram</w:t>
-            </w:r>
-            <w:proofErr w:type="spellEnd"/>
+              <w:t>Memoria Ram</w:t>
+            </w:r>
           </w:p>
         </w:tc>
         <w:tc>
@@ -6902,25 +6756,7 @@
                 <w:sz w:val="24"/>
                 <w:szCs w:val="24"/>
               </w:rPr>
-              <w:t xml:space="preserve">Intel UHD </w:t>
-            </w:r>
-            <w:proofErr w:type="spellStart"/>
-            <w:r>
-              <w:rPr>
-                <w:rFonts w:ascii="Arial" w:hAnsi="Arial" w:cs="Arial"/>
-                <w:sz w:val="24"/>
-                <w:szCs w:val="24"/>
-              </w:rPr>
-              <w:t>Graphics</w:t>
-            </w:r>
-            <w:proofErr w:type="spellEnd"/>
-            <w:r>
-              <w:rPr>
-                <w:rFonts w:ascii="Arial" w:hAnsi="Arial" w:cs="Arial"/>
-                <w:sz w:val="24"/>
-                <w:szCs w:val="24"/>
-              </w:rPr>
-              <w:t xml:space="preserve"> 630</w:t>
+              <w:t>Intel UHD Graphics 630</w:t>
             </w:r>
           </w:p>
         </w:tc>
@@ -8401,23 +8237,13 @@
                 <w:szCs w:val="24"/>
               </w:rPr>
             </w:pPr>
-            <w:proofErr w:type="spellStart"/>
-            <w:r>
-              <w:rPr>
-                <w:rFonts w:ascii="Arial" w:hAnsi="Arial" w:cs="Arial"/>
-                <w:sz w:val="24"/>
-                <w:szCs w:val="24"/>
-              </w:rPr>
-              <w:t>OptiPlex</w:t>
-            </w:r>
-            <w:proofErr w:type="spellEnd"/>
-            <w:r>
-              <w:rPr>
-                <w:rFonts w:ascii="Arial" w:hAnsi="Arial" w:cs="Arial"/>
-                <w:sz w:val="24"/>
-                <w:szCs w:val="24"/>
-              </w:rPr>
-              <w:t xml:space="preserve"> 3050</w:t>
+            <w:r>
+              <w:rPr>
+                <w:rFonts w:ascii="Arial" w:hAnsi="Arial" w:cs="Arial"/>
+                <w:sz w:val="24"/>
+                <w:szCs w:val="24"/>
+              </w:rPr>
+              <w:t>OptiPlex 3050</w:t>
             </w:r>
           </w:p>
         </w:tc>
@@ -8778,18 +8604,8 @@
                 <w:sz w:val="24"/>
                 <w:szCs w:val="24"/>
               </w:rPr>
-              <w:t xml:space="preserve">Memoria </w:t>
-            </w:r>
-            <w:proofErr w:type="spellStart"/>
-            <w:r>
-              <w:rPr>
-                <w:rFonts w:ascii="Arial" w:hAnsi="Arial" w:cs="Arial"/>
-                <w:sz w:val="24"/>
-                <w:szCs w:val="24"/>
-              </w:rPr>
-              <w:t>Ram</w:t>
-            </w:r>
-            <w:proofErr w:type="spellEnd"/>
+              <w:t>Memoria Ram</w:t>
+            </w:r>
           </w:p>
         </w:tc>
         <w:tc>
@@ -9038,18 +8854,8 @@
                 <w:sz w:val="24"/>
                 <w:szCs w:val="24"/>
               </w:rPr>
-              <w:t xml:space="preserve">238GB SSD </w:t>
-            </w:r>
-            <w:proofErr w:type="spellStart"/>
-            <w:r>
-              <w:rPr>
-                <w:rFonts w:ascii="Arial" w:hAnsi="Arial" w:cs="Arial"/>
-                <w:sz w:val="24"/>
-                <w:szCs w:val="24"/>
-              </w:rPr>
-              <w:t>KingFast</w:t>
-            </w:r>
-            <w:proofErr w:type="spellEnd"/>
+              <w:t>238GB SSD KingFast</w:t>
+            </w:r>
           </w:p>
         </w:tc>
       </w:tr>
@@ -9126,25 +8932,7 @@
                 <w:sz w:val="24"/>
                 <w:szCs w:val="24"/>
               </w:rPr>
-              <w:t xml:space="preserve">Intel HD </w:t>
-            </w:r>
-            <w:proofErr w:type="spellStart"/>
-            <w:r>
-              <w:rPr>
-                <w:rFonts w:ascii="Arial" w:hAnsi="Arial" w:cs="Arial"/>
-                <w:sz w:val="24"/>
-                <w:szCs w:val="24"/>
-              </w:rPr>
-              <w:t>Graphics</w:t>
-            </w:r>
-            <w:proofErr w:type="spellEnd"/>
-            <w:r>
-              <w:rPr>
-                <w:rFonts w:ascii="Arial" w:hAnsi="Arial" w:cs="Arial"/>
-                <w:sz w:val="24"/>
-                <w:szCs w:val="24"/>
-              </w:rPr>
-              <w:t xml:space="preserve"> 530</w:t>
+              <w:t>Intel HD Graphics 530</w:t>
             </w:r>
           </w:p>
         </w:tc>
@@ -10641,23 +10429,13 @@
                 <w:szCs w:val="24"/>
               </w:rPr>
             </w:pPr>
-            <w:proofErr w:type="spellStart"/>
-            <w:r>
-              <w:rPr>
-                <w:rFonts w:ascii="Arial" w:hAnsi="Arial" w:cs="Arial"/>
-                <w:sz w:val="24"/>
-                <w:szCs w:val="24"/>
-              </w:rPr>
-              <w:t>OptiPlex</w:t>
-            </w:r>
-            <w:proofErr w:type="spellEnd"/>
-            <w:r>
-              <w:rPr>
-                <w:rFonts w:ascii="Arial" w:hAnsi="Arial" w:cs="Arial"/>
-                <w:sz w:val="24"/>
-                <w:szCs w:val="24"/>
-              </w:rPr>
-              <w:t xml:space="preserve"> 7010</w:t>
+            <w:r>
+              <w:rPr>
+                <w:rFonts w:ascii="Arial" w:hAnsi="Arial" w:cs="Arial"/>
+                <w:sz w:val="24"/>
+                <w:szCs w:val="24"/>
+              </w:rPr>
+              <w:t>OptiPlex 7010</w:t>
             </w:r>
           </w:p>
         </w:tc>
@@ -10727,6 +10505,14 @@
                 <w:szCs w:val="24"/>
               </w:rPr>
             </w:pPr>
+            <w:r>
+              <w:rPr>
+                <w:rFonts w:ascii="Arial" w:hAnsi="Arial" w:cs="Arial"/>
+                <w:sz w:val="24"/>
+                <w:szCs w:val="24"/>
+              </w:rPr>
+              <w:t>DW7YBZ1</w:t>
+            </w:r>
           </w:p>
         </w:tc>
       </w:tr>
@@ -10874,6 +10660,14 @@
                 <w:szCs w:val="24"/>
               </w:rPr>
             </w:pPr>
+            <w:r>
+              <w:rPr>
+                <w:rFonts w:ascii="Arial" w:hAnsi="Arial" w:cs="Arial"/>
+                <w:sz w:val="24"/>
+                <w:szCs w:val="24"/>
+              </w:rPr>
+              <w:t>131.106.0.82</w:t>
+            </w:r>
           </w:p>
         </w:tc>
       </w:tr>
@@ -10942,6 +10736,14 @@
                 <w:szCs w:val="24"/>
               </w:rPr>
             </w:pPr>
+            <w:r>
+              <w:rPr>
+                <w:rFonts w:ascii="Arial" w:hAnsi="Arial" w:cs="Arial"/>
+                <w:sz w:val="24"/>
+                <w:szCs w:val="24"/>
+              </w:rPr>
+              <w:t>Intel Core, i7-3770</w:t>
+            </w:r>
           </w:p>
         </w:tc>
       </w:tr>
@@ -10994,32 +10796,30 @@
                 <w:sz w:val="24"/>
                 <w:szCs w:val="24"/>
               </w:rPr>
-              <w:t xml:space="preserve">Memoria </w:t>
-            </w:r>
-            <w:proofErr w:type="spellStart"/>
-            <w:r>
-              <w:rPr>
-                <w:rFonts w:ascii="Arial" w:hAnsi="Arial" w:cs="Arial"/>
-                <w:sz w:val="24"/>
-                <w:szCs w:val="24"/>
-              </w:rPr>
-              <w:t>Ram</w:t>
-            </w:r>
-            <w:proofErr w:type="spellEnd"/>
-          </w:p>
-        </w:tc>
-        <w:tc>
-          <w:tcPr>
-            <w:tcW w:w="1514" w:type="pct"/>
-          </w:tcPr>
-          <w:p>
-            <w:pPr>
-              <w:rPr>
-                <w:rFonts w:ascii="Arial" w:hAnsi="Arial" w:cs="Arial"/>
-                <w:sz w:val="24"/>
-                <w:szCs w:val="24"/>
-              </w:rPr>
-            </w:pPr>
+              <w:t>Memoria Ram</w:t>
+            </w:r>
+          </w:p>
+        </w:tc>
+        <w:tc>
+          <w:tcPr>
+            <w:tcW w:w="1514" w:type="pct"/>
+          </w:tcPr>
+          <w:p>
+            <w:pPr>
+              <w:rPr>
+                <w:rFonts w:ascii="Arial" w:hAnsi="Arial" w:cs="Arial"/>
+                <w:sz w:val="24"/>
+                <w:szCs w:val="24"/>
+              </w:rPr>
+            </w:pPr>
+            <w:r>
+              <w:rPr>
+                <w:rFonts w:ascii="Arial" w:hAnsi="Arial" w:cs="Arial"/>
+                <w:sz w:val="24"/>
+                <w:szCs w:val="24"/>
+              </w:rPr>
+              <w:t>16 GB DDR3</w:t>
+            </w:r>
           </w:p>
         </w:tc>
       </w:tr>
@@ -11088,6 +10888,14 @@
                 <w:szCs w:val="24"/>
               </w:rPr>
             </w:pPr>
+            <w:r>
+              <w:rPr>
+                <w:rFonts w:ascii="Arial" w:hAnsi="Arial" w:cs="Arial"/>
+                <w:sz w:val="24"/>
+                <w:szCs w:val="24"/>
+              </w:rPr>
+              <w:t>4</w:t>
+            </w:r>
           </w:p>
         </w:tc>
       </w:tr>
@@ -11156,6 +10964,14 @@
                 <w:szCs w:val="24"/>
               </w:rPr>
             </w:pPr>
+            <w:r>
+              <w:rPr>
+                <w:rFonts w:ascii="Arial" w:hAnsi="Arial" w:cs="Arial"/>
+                <w:sz w:val="24"/>
+                <w:szCs w:val="24"/>
+              </w:rPr>
+              <w:t>4</w:t>
+            </w:r>
           </w:p>
         </w:tc>
       </w:tr>
@@ -11224,6 +11040,14 @@
                 <w:szCs w:val="24"/>
               </w:rPr>
             </w:pPr>
+            <w:r>
+              <w:rPr>
+                <w:rFonts w:ascii="Arial" w:hAnsi="Arial" w:cs="Arial"/>
+                <w:sz w:val="24"/>
+                <w:szCs w:val="24"/>
+              </w:rPr>
+              <w:t>477GB SSD S900-512</w:t>
+            </w:r>
           </w:p>
         </w:tc>
       </w:tr>
@@ -11294,6 +11118,14 @@
                 <w:szCs w:val="24"/>
               </w:rPr>
             </w:pPr>
+            <w:r>
+              <w:rPr>
+                <w:rFonts w:ascii="Arial" w:hAnsi="Arial" w:cs="Arial"/>
+                <w:sz w:val="24"/>
+                <w:szCs w:val="24"/>
+              </w:rPr>
+              <w:t>Intel HD Graphics 4000</w:t>
+            </w:r>
           </w:p>
         </w:tc>
       </w:tr>
@@ -11362,6 +11194,14 @@
                 <w:szCs w:val="24"/>
               </w:rPr>
             </w:pPr>
+            <w:r>
+              <w:rPr>
+                <w:rFonts w:ascii="Arial" w:hAnsi="Arial" w:cs="Arial"/>
+                <w:sz w:val="24"/>
+                <w:szCs w:val="24"/>
+              </w:rPr>
+              <w:t>1</w:t>
+            </w:r>
           </w:p>
         </w:tc>
       </w:tr>
@@ -11430,6 +11270,14 @@
                 <w:szCs w:val="24"/>
               </w:rPr>
             </w:pPr>
+            <w:r>
+              <w:rPr>
+                <w:rFonts w:ascii="Arial" w:hAnsi="Arial" w:cs="Arial"/>
+                <w:sz w:val="24"/>
+                <w:szCs w:val="24"/>
+              </w:rPr>
+              <w:t>4</w:t>
+            </w:r>
           </w:p>
         </w:tc>
       </w:tr>
@@ -11498,6 +11346,14 @@
                 <w:szCs w:val="24"/>
               </w:rPr>
             </w:pPr>
+            <w:r>
+              <w:rPr>
+                <w:rFonts w:ascii="Arial" w:hAnsi="Arial" w:cs="Arial"/>
+                <w:sz w:val="24"/>
+                <w:szCs w:val="24"/>
+              </w:rPr>
+              <w:t>VGA, Serie</w:t>
+            </w:r>
           </w:p>
         </w:tc>
       </w:tr>
@@ -11576,6 +11432,14 @@
                 <w:szCs w:val="24"/>
               </w:rPr>
             </w:pPr>
+            <w:r>
+              <w:rPr>
+                <w:rFonts w:ascii="Arial" w:hAnsi="Arial" w:cs="Arial"/>
+                <w:sz w:val="24"/>
+                <w:szCs w:val="24"/>
+              </w:rPr>
+              <w:t>APC</w:t>
+            </w:r>
           </w:p>
         </w:tc>
       </w:tr>
@@ -11646,6 +11510,14 @@
                 <w:szCs w:val="24"/>
               </w:rPr>
             </w:pPr>
+            <w:r>
+              <w:rPr>
+                <w:rFonts w:ascii="Arial" w:hAnsi="Arial" w:cs="Arial"/>
+                <w:sz w:val="24"/>
+                <w:szCs w:val="24"/>
+              </w:rPr>
+              <w:t>BE600M1</w:t>
+            </w:r>
           </w:p>
         </w:tc>
       </w:tr>
@@ -11714,6 +11586,14 @@
                 <w:szCs w:val="24"/>
               </w:rPr>
             </w:pPr>
+            <w:r>
+              <w:rPr>
+                <w:rFonts w:ascii="Arial" w:hAnsi="Arial" w:cs="Arial"/>
+                <w:sz w:val="24"/>
+                <w:szCs w:val="24"/>
+              </w:rPr>
+              <w:t>4B2207P11881</w:t>
+            </w:r>
           </w:p>
         </w:tc>
       </w:tr>
@@ -11782,6 +11662,14 @@
                 <w:szCs w:val="24"/>
               </w:rPr>
             </w:pPr>
+            <w:r>
+              <w:rPr>
+                <w:rFonts w:ascii="Arial" w:hAnsi="Arial" w:cs="Arial"/>
+                <w:sz w:val="24"/>
+                <w:szCs w:val="24"/>
+              </w:rPr>
+              <w:t>600VA</w:t>
+            </w:r>
           </w:p>
         </w:tc>
       </w:tr>
@@ -11860,6 +11748,14 @@
                 <w:szCs w:val="24"/>
               </w:rPr>
             </w:pPr>
+            <w:r>
+              <w:rPr>
+                <w:rFonts w:ascii="Arial" w:hAnsi="Arial" w:cs="Arial"/>
+                <w:sz w:val="24"/>
+                <w:szCs w:val="24"/>
+              </w:rPr>
+              <w:t>AOC</w:t>
+            </w:r>
           </w:p>
         </w:tc>
       </w:tr>
@@ -11930,6 +11826,14 @@
                 <w:szCs w:val="24"/>
               </w:rPr>
             </w:pPr>
+            <w:r>
+              <w:rPr>
+                <w:rFonts w:ascii="Arial" w:hAnsi="Arial" w:cs="Arial"/>
+                <w:sz w:val="24"/>
+                <w:szCs w:val="24"/>
+              </w:rPr>
+              <w:t>E970Swn</w:t>
+            </w:r>
           </w:p>
         </w:tc>
       </w:tr>
@@ -12000,6 +11904,14 @@
                 <w:szCs w:val="24"/>
               </w:rPr>
             </w:pPr>
+            <w:r>
+              <w:rPr>
+                <w:rFonts w:ascii="Arial" w:hAnsi="Arial" w:cs="Arial"/>
+                <w:sz w:val="24"/>
+                <w:szCs w:val="24"/>
+              </w:rPr>
+              <w:t>FVLE3HA137223</w:t>
+            </w:r>
           </w:p>
         </w:tc>
       </w:tr>
@@ -12070,6 +11982,14 @@
                 <w:szCs w:val="24"/>
               </w:rPr>
             </w:pPr>
+            <w:r>
+              <w:rPr>
+                <w:rFonts w:ascii="Arial" w:hAnsi="Arial" w:cs="Arial"/>
+                <w:sz w:val="24"/>
+                <w:szCs w:val="24"/>
+              </w:rPr>
+              <w:t>VGA</w:t>
+            </w:r>
           </w:p>
         </w:tc>
       </w:tr>
@@ -12148,6 +12068,14 @@
                 <w:szCs w:val="24"/>
               </w:rPr>
             </w:pPr>
+            <w:r>
+              <w:rPr>
+                <w:rFonts w:ascii="Arial" w:hAnsi="Arial" w:cs="Arial"/>
+                <w:sz w:val="24"/>
+                <w:szCs w:val="24"/>
+              </w:rPr>
+              <w:t>DELUX</w:t>
+            </w:r>
           </w:p>
         </w:tc>
       </w:tr>
@@ -12216,6 +12144,14 @@
                 <w:szCs w:val="24"/>
               </w:rPr>
             </w:pPr>
+            <w:r>
+              <w:rPr>
+                <w:rFonts w:ascii="Arial" w:hAnsi="Arial" w:cs="Arial"/>
+                <w:sz w:val="24"/>
+                <w:szCs w:val="24"/>
+              </w:rPr>
+              <w:t>K7009</w:t>
+            </w:r>
           </w:p>
         </w:tc>
       </w:tr>
@@ -12294,6 +12230,14 @@
                 <w:szCs w:val="24"/>
               </w:rPr>
             </w:pPr>
+            <w:r>
+              <w:rPr>
+                <w:rFonts w:ascii="Arial" w:hAnsi="Arial" w:cs="Arial"/>
+                <w:sz w:val="24"/>
+                <w:szCs w:val="24"/>
+              </w:rPr>
+              <w:t>DELL</w:t>
+            </w:r>
           </w:p>
         </w:tc>
       </w:tr>
@@ -12504,7 +12448,6 @@
           <w:sz w:val="24"/>
           <w:szCs w:val="24"/>
         </w:rPr>
-        <w:lastRenderedPageBreak/>
         <w:t>7.</w:t>
       </w:r>
     </w:p>
@@ -13002,18 +12945,8 @@
                 <w:sz w:val="24"/>
                 <w:szCs w:val="24"/>
               </w:rPr>
-              <w:t xml:space="preserve">Memoria </w:t>
-            </w:r>
-            <w:proofErr w:type="spellStart"/>
-            <w:r>
-              <w:rPr>
-                <w:rFonts w:ascii="Arial" w:hAnsi="Arial" w:cs="Arial"/>
-                <w:sz w:val="24"/>
-                <w:szCs w:val="24"/>
-              </w:rPr>
-              <w:t>Ram</w:t>
-            </w:r>
-            <w:proofErr w:type="spellEnd"/>
+              <w:t>Memoria Ram</w:t>
+            </w:r>
           </w:p>
         </w:tc>
         <w:tc>
@@ -14504,7 +14437,6 @@
           <w:sz w:val="24"/>
           <w:szCs w:val="24"/>
         </w:rPr>
-        <w:lastRenderedPageBreak/>
         <w:t>8.</w:t>
       </w:r>
     </w:p>
@@ -15002,18 +14934,8 @@
                 <w:sz w:val="24"/>
                 <w:szCs w:val="24"/>
               </w:rPr>
-              <w:t xml:space="preserve">Memoria </w:t>
-            </w:r>
-            <w:proofErr w:type="spellStart"/>
-            <w:r>
-              <w:rPr>
-                <w:rFonts w:ascii="Arial" w:hAnsi="Arial" w:cs="Arial"/>
-                <w:sz w:val="24"/>
-                <w:szCs w:val="24"/>
-              </w:rPr>
-              <w:t>Ram</w:t>
-            </w:r>
-            <w:proofErr w:type="spellEnd"/>
+              <w:t>Memoria Ram</w:t>
+            </w:r>
           </w:p>
         </w:tc>
         <w:tc>
@@ -16504,7 +16426,6 @@
           <w:sz w:val="24"/>
           <w:szCs w:val="24"/>
         </w:rPr>
-        <w:lastRenderedPageBreak/>
         <w:t>9.</w:t>
       </w:r>
     </w:p>
@@ -17002,18 +16923,8 @@
                 <w:sz w:val="24"/>
                 <w:szCs w:val="24"/>
               </w:rPr>
-              <w:t xml:space="preserve">Memoria </w:t>
-            </w:r>
-            <w:proofErr w:type="spellStart"/>
-            <w:r>
-              <w:rPr>
-                <w:rFonts w:ascii="Arial" w:hAnsi="Arial" w:cs="Arial"/>
-                <w:sz w:val="24"/>
-                <w:szCs w:val="24"/>
-              </w:rPr>
-              <w:t>Ram</w:t>
-            </w:r>
-            <w:proofErr w:type="spellEnd"/>
+              <w:t>Memoria Ram</w:t>
+            </w:r>
           </w:p>
         </w:tc>
         <w:tc>
@@ -18398,7 +18309,7 @@
 </file>
 
 <file path=word/styles.xml><?xml version="1.0" encoding="utf-8"?>
-<w:styles xmlns:mc="http://schemas.openxmlformats.org/markup-compatibility/2006" xmlns:r="http://schemas.openxmlformats.org/officeDocument/2006/relationships" xmlns:w="http://schemas.openxmlformats.org/wordprocessingml/2006/main" xmlns:w14="http://schemas.microsoft.com/office/word/2010/wordml" xmlns:w15="http://schemas.microsoft.com/office/word/2012/wordml" xmlns:w16cex="http://schemas.microsoft.com/office/word/2018/wordml/cex" xmlns:w16cid="http://schemas.microsoft.com/office/word/2016/wordml/cid" xmlns:w16="http://schemas.microsoft.com/office/word/2018/wordml" xmlns:w16sdtdh="http://schemas.microsoft.com/office/word/2020/wordml/sdtdatahash" xmlns:w16se="http://schemas.microsoft.com/office/word/2015/wordml/symex" mc:Ignorable="w14 w15 w16se w16cid w16 w16cex w16sdtdh">
+<w:styles xmlns:mc="http://schemas.openxmlformats.org/markup-compatibility/2006" xmlns:r="http://schemas.openxmlformats.org/officeDocument/2006/relationships" xmlns:w="http://schemas.openxmlformats.org/wordprocessingml/2006/main" xmlns:w14="http://schemas.microsoft.com/office/word/2010/wordml" xmlns:w15="http://schemas.microsoft.com/office/word/2012/wordml" xmlns:w16cex="http://schemas.microsoft.com/office/word/2018/wordml/cex" xmlns:w16cid="http://schemas.microsoft.com/office/word/2016/wordml/cid" xmlns:w16="http://schemas.microsoft.com/office/word/2018/wordml" xmlns:w16du="http://schemas.microsoft.com/office/word/2023/wordml/word16du" xmlns:w16sdtdh="http://schemas.microsoft.com/office/word/2020/wordml/sdtdatahash" xmlns:w16sdtfl="http://schemas.microsoft.com/office/word/2024/wordml/sdtformatlock" xmlns:w16se="http://schemas.microsoft.com/office/word/2015/wordml/symex" mc:Ignorable="w14 w15 w16se w16cid w16 w16cex w16sdtdh w16sdtfl w16du">
   <w:docDefaults>
     <w:rPrDefault>
       <w:rPr>

</xml_diff>